<commit_message>
Add the strict-screening Includes to the study outline docx
Bring LVR_Q_Study_Outline.docx in line with LVR_Q_Study_Outline.md by
adding the same 28 strict-screening Includes to its "Key sources so
far" list.

Co-Authored-By: Claude Opus 5.5 <noreply@anthropic.com>
</commit_message>
<xml_diff>
--- a/data/LVR_Q_Study_Outline.docx
+++ b/data/LVR_Q_Study_Outline.docx
@@ -1738,6 +1738,1070 @@
             <w14:ligatures w14:val="none"/>
           </w:rPr>
           <w:t>HealthLink BC: Legal blindness</w:t>
+        </w:r>
+      </w:hyperlink>
+    </w:p>
+    <w:p>
+      <w:pPr>
+        <w:pStyle w:val="ListParagraph"/>
+        <w:spacing w:before="100" w:beforeAutospacing="1" w:after="100" w:afterAutospacing="1" w:line="240" w:lineRule="auto"/>
+        <w:rPr>
+          <w:rFonts w:ascii="Times New Roman" w:eastAsia="Times New Roman" w:hAnsi="Times New Roman" w:cs="Times New Roman"/>
+          <w:kern w:val="0"/>
+          <w14:ligatures w14:val="none"/>
+        </w:rPr>
+      </w:pPr>
+    </w:p>
+    <w:p>
+      <w:pPr>
+        <w:pStyle w:val="ListParagraph"/>
+        <w:numPr>
+          <w:ilvl w:val="0"/>
+          <w:numId w:val="3"/>
+        </w:numPr>
+        <w:spacing w:before="100" w:beforeAutospacing="1" w:after="100" w:afterAutospacing="1" w:line="240" w:lineRule="auto"/>
+        <w:rPr>
+          <w:rFonts w:ascii="Times New Roman" w:eastAsia="Times New Roman" w:hAnsi="Times New Roman" w:cs="Times New Roman"/>
+          <w:kern w:val="0"/>
+          <w14:ligatures w14:val="none"/>
+        </w:rPr>
+      </w:pPr>
+      <w:hyperlink r:id="rId15" w:tgtFrame="_blank" w:history="1">
+        <w:r>
+          <w:rPr>
+            <w:rFonts w:ascii="Times New Roman" w:eastAsia="Times New Roman" w:hAnsi="Times New Roman" w:cs="Times New Roman"/>
+            <w:color w:val="0000FF"/>
+            <w:kern w:val="0"/>
+            <w:u w:val="single"/>
+            <w14:ligatures w14:val="none"/>
+          </w:rPr>
+          <w:t xml:space="preserve">Gothwal VK et al. Andhra Pradesh Eye Disease Study – Visual Function Questionnaire: further improvements in psychometric properties using Rasch analysis. Ophthalmic Epidemiol 2012</w:t>
+        </w:r>
+      </w:hyperlink>
+    </w:p>
+    <w:p>
+      <w:pPr>
+        <w:pStyle w:val="ListParagraph"/>
+        <w:spacing w:before="100" w:beforeAutospacing="1" w:after="100" w:afterAutospacing="1" w:line="240" w:lineRule="auto"/>
+        <w:rPr>
+          <w:rFonts w:ascii="Times New Roman" w:eastAsia="Times New Roman" w:hAnsi="Times New Roman" w:cs="Times New Roman"/>
+          <w:kern w:val="0"/>
+          <w14:ligatures w14:val="none"/>
+        </w:rPr>
+      </w:pPr>
+    </w:p>
+    <w:p>
+      <w:pPr>
+        <w:pStyle w:val="ListParagraph"/>
+        <w:numPr>
+          <w:ilvl w:val="0"/>
+          <w:numId w:val="3"/>
+        </w:numPr>
+        <w:spacing w:before="100" w:beforeAutospacing="1" w:after="100" w:afterAutospacing="1" w:line="240" w:lineRule="auto"/>
+        <w:rPr>
+          <w:rFonts w:ascii="Times New Roman" w:eastAsia="Times New Roman" w:hAnsi="Times New Roman" w:cs="Times New Roman"/>
+          <w:kern w:val="0"/>
+          <w14:ligatures w14:val="none"/>
+        </w:rPr>
+      </w:pPr>
+      <w:hyperlink r:id="rId16" w:tgtFrame="_blank" w:history="1">
+        <w:r>
+          <w:rPr>
+            <w:rFonts w:ascii="Times New Roman" w:eastAsia="Times New Roman" w:hAnsi="Times New Roman" w:cs="Times New Roman"/>
+            <w:color w:val="0000FF"/>
+            <w:kern w:val="0"/>
+            <w:u w:val="single"/>
+            <w14:ligatures w14:val="none"/>
+          </w:rPr>
+          <w:t xml:space="preserve">Potter T et al. Concordance between self-reported visual difficulty and objective visual impairment: the National Health and Aging Trends Study. Ophthalmology 2024</w:t>
+        </w:r>
+      </w:hyperlink>
+    </w:p>
+    <w:p>
+      <w:pPr>
+        <w:pStyle w:val="ListParagraph"/>
+        <w:spacing w:before="100" w:beforeAutospacing="1" w:after="100" w:afterAutospacing="1" w:line="240" w:lineRule="auto"/>
+        <w:rPr>
+          <w:rFonts w:ascii="Times New Roman" w:eastAsia="Times New Roman" w:hAnsi="Times New Roman" w:cs="Times New Roman"/>
+          <w:kern w:val="0"/>
+          <w14:ligatures w14:val="none"/>
+        </w:rPr>
+      </w:pPr>
+    </w:p>
+    <w:p>
+      <w:pPr>
+        <w:pStyle w:val="ListParagraph"/>
+        <w:numPr>
+          <w:ilvl w:val="0"/>
+          <w:numId w:val="3"/>
+        </w:numPr>
+        <w:spacing w:before="100" w:beforeAutospacing="1" w:after="100" w:afterAutospacing="1" w:line="240" w:lineRule="auto"/>
+        <w:rPr>
+          <w:rFonts w:ascii="Times New Roman" w:eastAsia="Times New Roman" w:hAnsi="Times New Roman" w:cs="Times New Roman"/>
+          <w:kern w:val="0"/>
+          <w14:ligatures w14:val="none"/>
+        </w:rPr>
+      </w:pPr>
+      <w:hyperlink r:id="rId17" w:tgtFrame="_blank" w:history="1">
+        <w:r>
+          <w:rPr>
+            <w:rFonts w:ascii="Times New Roman" w:eastAsia="Times New Roman" w:hAnsi="Times New Roman" w:cs="Times New Roman"/>
+            <w:color w:val="0000FF"/>
+            <w:kern w:val="0"/>
+            <w:u w:val="single"/>
+            <w14:ligatures w14:val="none"/>
+          </w:rPr>
+          <w:t xml:space="preserve">Wolffsohn JS et al. Design of the low vision quality-of-life questionnaire (LVQOL) and measuring the outcome of low-vision rehabilitation. Am J Ophthalmol 2000</w:t>
+        </w:r>
+      </w:hyperlink>
+    </w:p>
+    <w:p>
+      <w:pPr>
+        <w:pStyle w:val="ListParagraph"/>
+        <w:spacing w:before="100" w:beforeAutospacing="1" w:after="100" w:afterAutospacing="1" w:line="240" w:lineRule="auto"/>
+        <w:rPr>
+          <w:rFonts w:ascii="Times New Roman" w:eastAsia="Times New Roman" w:hAnsi="Times New Roman" w:cs="Times New Roman"/>
+          <w:kern w:val="0"/>
+          <w14:ligatures w14:val="none"/>
+        </w:rPr>
+      </w:pPr>
+    </w:p>
+    <w:p>
+      <w:pPr>
+        <w:pStyle w:val="ListParagraph"/>
+        <w:numPr>
+          <w:ilvl w:val="0"/>
+          <w:numId w:val="3"/>
+        </w:numPr>
+        <w:spacing w:before="100" w:beforeAutospacing="1" w:after="100" w:afterAutospacing="1" w:line="240" w:lineRule="auto"/>
+        <w:rPr>
+          <w:rFonts w:ascii="Times New Roman" w:eastAsia="Times New Roman" w:hAnsi="Times New Roman" w:cs="Times New Roman"/>
+          <w:kern w:val="0"/>
+          <w14:ligatures w14:val="none"/>
+        </w:rPr>
+      </w:pPr>
+      <w:hyperlink r:id="rId18" w:tgtFrame="_blank" w:history="1">
+        <w:r>
+          <w:rPr>
+            <w:rFonts w:ascii="Times New Roman" w:eastAsia="Times New Roman" w:hAnsi="Times New Roman" w:cs="Times New Roman"/>
+            <w:color w:val="0000FF"/>
+            <w:kern w:val="0"/>
+            <w:u w:val="single"/>
+            <w14:ligatures w14:val="none"/>
+          </w:rPr>
+          <w:t xml:space="preserve">Labreche T et al. Development and validation of Visual Impairment as a Risk for Falls Questionnaire. Age Ageing 2018</w:t>
+        </w:r>
+      </w:hyperlink>
+    </w:p>
+    <w:p>
+      <w:pPr>
+        <w:pStyle w:val="ListParagraph"/>
+        <w:spacing w:before="100" w:beforeAutospacing="1" w:after="100" w:afterAutospacing="1" w:line="240" w:lineRule="auto"/>
+        <w:rPr>
+          <w:rFonts w:ascii="Times New Roman" w:eastAsia="Times New Roman" w:hAnsi="Times New Roman" w:cs="Times New Roman"/>
+          <w:kern w:val="0"/>
+          <w14:ligatures w14:val="none"/>
+        </w:rPr>
+      </w:pPr>
+    </w:p>
+    <w:p>
+      <w:pPr>
+        <w:pStyle w:val="ListParagraph"/>
+        <w:numPr>
+          <w:ilvl w:val="0"/>
+          <w:numId w:val="3"/>
+        </w:numPr>
+        <w:spacing w:before="100" w:beforeAutospacing="1" w:after="100" w:afterAutospacing="1" w:line="240" w:lineRule="auto"/>
+        <w:rPr>
+          <w:rFonts w:ascii="Times New Roman" w:eastAsia="Times New Roman" w:hAnsi="Times New Roman" w:cs="Times New Roman"/>
+          <w:kern w:val="0"/>
+          <w14:ligatures w14:val="none"/>
+        </w:rPr>
+      </w:pPr>
+      <w:hyperlink r:id="rId19" w:tgtFrame="_blank" w:history="1">
+        <w:r>
+          <w:rPr>
+            <w:rFonts w:ascii="Times New Roman" w:eastAsia="Times New Roman" w:hAnsi="Times New Roman" w:cs="Times New Roman"/>
+            <w:color w:val="0000FF"/>
+            <w:kern w:val="0"/>
+            <w:u w:val="single"/>
+            <w14:ligatures w14:val="none"/>
+          </w:rPr>
+          <w:t xml:space="preserve">Stalin A et al. Development of a screening tool for reduced vision among inpatients of hospital rehabilitation units. Optom Vis Sci 2025</w:t>
+        </w:r>
+      </w:hyperlink>
+    </w:p>
+    <w:p>
+      <w:pPr>
+        <w:pStyle w:val="ListParagraph"/>
+        <w:spacing w:before="100" w:beforeAutospacing="1" w:after="100" w:afterAutospacing="1" w:line="240" w:lineRule="auto"/>
+        <w:rPr>
+          <w:rFonts w:ascii="Times New Roman" w:eastAsia="Times New Roman" w:hAnsi="Times New Roman" w:cs="Times New Roman"/>
+          <w:kern w:val="0"/>
+          <w14:ligatures w14:val="none"/>
+        </w:rPr>
+      </w:pPr>
+    </w:p>
+    <w:p>
+      <w:pPr>
+        <w:pStyle w:val="ListParagraph"/>
+        <w:numPr>
+          <w:ilvl w:val="0"/>
+          <w:numId w:val="3"/>
+        </w:numPr>
+        <w:spacing w:before="100" w:beforeAutospacing="1" w:after="100" w:afterAutospacing="1" w:line="240" w:lineRule="auto"/>
+        <w:rPr>
+          <w:rFonts w:ascii="Times New Roman" w:eastAsia="Times New Roman" w:hAnsi="Times New Roman" w:cs="Times New Roman"/>
+          <w:kern w:val="0"/>
+          <w14:ligatures w14:val="none"/>
+        </w:rPr>
+      </w:pPr>
+      <w:hyperlink r:id="rId20" w:tgtFrame="_blank" w:history="1">
+        <w:r>
+          <w:rPr>
+            <w:rFonts w:ascii="Times New Roman" w:eastAsia="Times New Roman" w:hAnsi="Times New Roman" w:cs="Times New Roman"/>
+            <w:color w:val="0000FF"/>
+            <w:kern w:val="0"/>
+            <w:u w:val="single"/>
+            <w14:ligatures w14:val="none"/>
+          </w:rPr>
+          <w:t xml:space="preserve">Rowe FJ et al. European Stroke Organisation (ESO) guideline on visual impairment in stroke. Eur Stroke J 2025</w:t>
+        </w:r>
+      </w:hyperlink>
+    </w:p>
+    <w:p>
+      <w:pPr>
+        <w:pStyle w:val="ListParagraph"/>
+        <w:spacing w:before="100" w:beforeAutospacing="1" w:after="100" w:afterAutospacing="1" w:line="240" w:lineRule="auto"/>
+        <w:rPr>
+          <w:rFonts w:ascii="Times New Roman" w:eastAsia="Times New Roman" w:hAnsi="Times New Roman" w:cs="Times New Roman"/>
+          <w:kern w:val="0"/>
+          <w14:ligatures w14:val="none"/>
+        </w:rPr>
+      </w:pPr>
+    </w:p>
+    <w:p>
+      <w:pPr>
+        <w:pStyle w:val="ListParagraph"/>
+        <w:numPr>
+          <w:ilvl w:val="0"/>
+          <w:numId w:val="3"/>
+        </w:numPr>
+        <w:spacing w:before="100" w:beforeAutospacing="1" w:after="100" w:afterAutospacing="1" w:line="240" w:lineRule="auto"/>
+        <w:rPr>
+          <w:rFonts w:ascii="Times New Roman" w:eastAsia="Times New Roman" w:hAnsi="Times New Roman" w:cs="Times New Roman"/>
+          <w:kern w:val="0"/>
+          <w14:ligatures w14:val="none"/>
+        </w:rPr>
+      </w:pPr>
+      <w:hyperlink r:id="rId21" w:tgtFrame="_blank" w:history="1">
+        <w:r>
+          <w:rPr>
+            <w:rFonts w:ascii="Times New Roman" w:eastAsia="Times New Roman" w:hAnsi="Times New Roman" w:cs="Times New Roman"/>
+            <w:color w:val="0000FF"/>
+            <w:kern w:val="0"/>
+            <w:u w:val="single"/>
+            <w14:ligatures w14:val="none"/>
+          </w:rPr>
+          <w:t xml:space="preserve">Babcock-Parziale J et al. Evaluating psychometric properties of a clinical and a self-report blind rehabilitation outcome measure. J Rehabil Res Dev 2005</w:t>
+        </w:r>
+      </w:hyperlink>
+    </w:p>
+    <w:p>
+      <w:pPr>
+        <w:pStyle w:val="ListParagraph"/>
+        <w:spacing w:before="100" w:beforeAutospacing="1" w:after="100" w:afterAutospacing="1" w:line="240" w:lineRule="auto"/>
+        <w:rPr>
+          <w:rFonts w:ascii="Times New Roman" w:eastAsia="Times New Roman" w:hAnsi="Times New Roman" w:cs="Times New Roman"/>
+          <w:kern w:val="0"/>
+          <w14:ligatures w14:val="none"/>
+        </w:rPr>
+      </w:pPr>
+    </w:p>
+    <w:p>
+      <w:pPr>
+        <w:pStyle w:val="ListParagraph"/>
+        <w:numPr>
+          <w:ilvl w:val="0"/>
+          <w:numId w:val="3"/>
+        </w:numPr>
+        <w:spacing w:before="100" w:beforeAutospacing="1" w:after="100" w:afterAutospacing="1" w:line="240" w:lineRule="auto"/>
+        <w:rPr>
+          <w:rFonts w:ascii="Times New Roman" w:eastAsia="Times New Roman" w:hAnsi="Times New Roman" w:cs="Times New Roman"/>
+          <w:kern w:val="0"/>
+          <w14:ligatures w14:val="none"/>
+        </w:rPr>
+      </w:pPr>
+      <w:hyperlink r:id="rId22" w:tgtFrame="_blank" w:history="1">
+        <w:r>
+          <w:rPr>
+            <w:rFonts w:ascii="Times New Roman" w:eastAsia="Times New Roman" w:hAnsi="Times New Roman" w:cs="Times New Roman"/>
+            <w:color w:val="0000FF"/>
+            <w:kern w:val="0"/>
+            <w:u w:val="single"/>
+            <w14:ligatures w14:val="none"/>
+          </w:rPr>
+          <w:t xml:space="preserve">Tabrett DR et al. Factors influencing self-reported vision-related activity limitation in the visually impaired. IOVS 2011</w:t>
+        </w:r>
+      </w:hyperlink>
+    </w:p>
+    <w:p>
+      <w:pPr>
+        <w:pStyle w:val="ListParagraph"/>
+        <w:spacing w:before="100" w:beforeAutospacing="1" w:after="100" w:afterAutospacing="1" w:line="240" w:lineRule="auto"/>
+        <w:rPr>
+          <w:rFonts w:ascii="Times New Roman" w:eastAsia="Times New Roman" w:hAnsi="Times New Roman" w:cs="Times New Roman"/>
+          <w:kern w:val="0"/>
+          <w14:ligatures w14:val="none"/>
+        </w:rPr>
+      </w:pPr>
+    </w:p>
+    <w:p>
+      <w:pPr>
+        <w:pStyle w:val="ListParagraph"/>
+        <w:numPr>
+          <w:ilvl w:val="0"/>
+          <w:numId w:val="3"/>
+        </w:numPr>
+        <w:spacing w:before="100" w:beforeAutospacing="1" w:after="100" w:afterAutospacing="1" w:line="240" w:lineRule="auto"/>
+        <w:rPr>
+          <w:rFonts w:ascii="Times New Roman" w:eastAsia="Times New Roman" w:hAnsi="Times New Roman" w:cs="Times New Roman"/>
+          <w:kern w:val="0"/>
+          <w14:ligatures w14:val="none"/>
+        </w:rPr>
+      </w:pPr>
+      <w:hyperlink r:id="rId23" w:tgtFrame="_blank" w:history="1">
+        <w:r>
+          <w:rPr>
+            <w:rFonts w:ascii="Times New Roman" w:eastAsia="Times New Roman" w:hAnsi="Times New Roman" w:cs="Times New Roman"/>
+            <w:color w:val="0000FF"/>
+            <w:kern w:val="0"/>
+            <w:u w:val="single"/>
+            <w14:ligatures w14:val="none"/>
+          </w:rPr>
+          <w:t xml:space="preserve">Pengo M et al. Impact of visual impairment on vision-related quality of life in Parkinson's disease. J Parkinsons Dis 2022</w:t>
+        </w:r>
+      </w:hyperlink>
+    </w:p>
+    <w:p>
+      <w:pPr>
+        <w:pStyle w:val="ListParagraph"/>
+        <w:spacing w:before="100" w:beforeAutospacing="1" w:after="100" w:afterAutospacing="1" w:line="240" w:lineRule="auto"/>
+        <w:rPr>
+          <w:rFonts w:ascii="Times New Roman" w:eastAsia="Times New Roman" w:hAnsi="Times New Roman" w:cs="Times New Roman"/>
+          <w:kern w:val="0"/>
+          <w14:ligatures w14:val="none"/>
+        </w:rPr>
+      </w:pPr>
+    </w:p>
+    <w:p>
+      <w:pPr>
+        <w:pStyle w:val="ListParagraph"/>
+        <w:numPr>
+          <w:ilvl w:val="0"/>
+          <w:numId w:val="3"/>
+        </w:numPr>
+        <w:spacing w:before="100" w:beforeAutospacing="1" w:after="100" w:afterAutospacing="1" w:line="240" w:lineRule="auto"/>
+        <w:rPr>
+          <w:rFonts w:ascii="Times New Roman" w:eastAsia="Times New Roman" w:hAnsi="Times New Roman" w:cs="Times New Roman"/>
+          <w:kern w:val="0"/>
+          <w14:ligatures w14:val="none"/>
+        </w:rPr>
+      </w:pPr>
+      <w:hyperlink r:id="rId24" w:tgtFrame="_blank" w:history="1">
+        <w:r>
+          <w:rPr>
+            <w:rFonts w:ascii="Times New Roman" w:eastAsia="Times New Roman" w:hAnsi="Times New Roman" w:cs="Times New Roman"/>
+            <w:color w:val="0000FF"/>
+            <w:kern w:val="0"/>
+            <w:u w:val="single"/>
+            <w14:ligatures w14:val="none"/>
+          </w:rPr>
+          <w:t xml:space="preserve">Sahu A et al. Is the high contrast visual acuity chart a good predictor of improvement in visual acuity with low vision aids? Indian J Ophthalmol 2021</w:t>
+        </w:r>
+      </w:hyperlink>
+    </w:p>
+    <w:p>
+      <w:pPr>
+        <w:pStyle w:val="ListParagraph"/>
+        <w:spacing w:before="100" w:beforeAutospacing="1" w:after="100" w:afterAutospacing="1" w:line="240" w:lineRule="auto"/>
+        <w:rPr>
+          <w:rFonts w:ascii="Times New Roman" w:eastAsia="Times New Roman" w:hAnsi="Times New Roman" w:cs="Times New Roman"/>
+          <w:kern w:val="0"/>
+          <w14:ligatures w14:val="none"/>
+        </w:rPr>
+      </w:pPr>
+    </w:p>
+    <w:p>
+      <w:pPr>
+        <w:pStyle w:val="ListParagraph"/>
+        <w:numPr>
+          <w:ilvl w:val="0"/>
+          <w:numId w:val="3"/>
+        </w:numPr>
+        <w:spacing w:before="100" w:beforeAutospacing="1" w:after="100" w:afterAutospacing="1" w:line="240" w:lineRule="auto"/>
+        <w:rPr>
+          <w:rFonts w:ascii="Times New Roman" w:eastAsia="Times New Roman" w:hAnsi="Times New Roman" w:cs="Times New Roman"/>
+          <w:kern w:val="0"/>
+          <w14:ligatures w14:val="none"/>
+        </w:rPr>
+      </w:pPr>
+      <w:hyperlink r:id="rId25" w:tgtFrame="_blank" w:history="1">
+        <w:r>
+          <w:rPr>
+            <w:rFonts w:ascii="Times New Roman" w:eastAsia="Times New Roman" w:hAnsi="Times New Roman" w:cs="Times New Roman"/>
+            <w:color w:val="0000FF"/>
+            <w:kern w:val="0"/>
+            <w:u w:val="single"/>
+            <w14:ligatures w14:val="none"/>
+          </w:rPr>
+          <w:t xml:space="preserve">Stelmack JA et al. Measuring low-vision rehabilitation outcomes with the NEI VFQ-25. IOVS 2002</w:t>
+        </w:r>
+      </w:hyperlink>
+    </w:p>
+    <w:p>
+      <w:pPr>
+        <w:pStyle w:val="ListParagraph"/>
+        <w:spacing w:before="100" w:beforeAutospacing="1" w:after="100" w:afterAutospacing="1" w:line="240" w:lineRule="auto"/>
+        <w:rPr>
+          <w:rFonts w:ascii="Times New Roman" w:eastAsia="Times New Roman" w:hAnsi="Times New Roman" w:cs="Times New Roman"/>
+          <w:kern w:val="0"/>
+          <w14:ligatures w14:val="none"/>
+        </w:rPr>
+      </w:pPr>
+    </w:p>
+    <w:p>
+      <w:pPr>
+        <w:pStyle w:val="ListParagraph"/>
+        <w:numPr>
+          <w:ilvl w:val="0"/>
+          <w:numId w:val="3"/>
+        </w:numPr>
+        <w:spacing w:before="100" w:beforeAutospacing="1" w:after="100" w:afterAutospacing="1" w:line="240" w:lineRule="auto"/>
+        <w:rPr>
+          <w:rFonts w:ascii="Times New Roman" w:eastAsia="Times New Roman" w:hAnsi="Times New Roman" w:cs="Times New Roman"/>
+          <w:kern w:val="0"/>
+          <w14:ligatures w14:val="none"/>
+        </w:rPr>
+      </w:pPr>
+      <w:hyperlink r:id="rId26" w:tgtFrame="_blank" w:history="1">
+        <w:r>
+          <w:rPr>
+            <w:rFonts w:ascii="Times New Roman" w:eastAsia="Times New Roman" w:hAnsi="Times New Roman" w:cs="Times New Roman"/>
+            <w:color w:val="0000FF"/>
+            <w:kern w:val="0"/>
+            <w:u w:val="single"/>
+            <w14:ligatures w14:val="none"/>
+          </w:rPr>
+          <w:t xml:space="preserve">Stelmack JA et al. Measuring outcomes of vision rehabilitation with the Veterans Affairs Low Vision Visual Functioning Questionnaire. IOVS 2006</w:t>
+        </w:r>
+      </w:hyperlink>
+    </w:p>
+    <w:p>
+      <w:pPr>
+        <w:pStyle w:val="ListParagraph"/>
+        <w:spacing w:before="100" w:beforeAutospacing="1" w:after="100" w:afterAutospacing="1" w:line="240" w:lineRule="auto"/>
+        <w:rPr>
+          <w:rFonts w:ascii="Times New Roman" w:eastAsia="Times New Roman" w:hAnsi="Times New Roman" w:cs="Times New Roman"/>
+          <w:kern w:val="0"/>
+          <w14:ligatures w14:val="none"/>
+        </w:rPr>
+      </w:pPr>
+    </w:p>
+    <w:p>
+      <w:pPr>
+        <w:pStyle w:val="ListParagraph"/>
+        <w:numPr>
+          <w:ilvl w:val="0"/>
+          <w:numId w:val="3"/>
+        </w:numPr>
+        <w:spacing w:before="100" w:beforeAutospacing="1" w:after="100" w:afterAutospacing="1" w:line="240" w:lineRule="auto"/>
+        <w:rPr>
+          <w:rFonts w:ascii="Times New Roman" w:eastAsia="Times New Roman" w:hAnsi="Times New Roman" w:cs="Times New Roman"/>
+          <w:kern w:val="0"/>
+          <w14:ligatures w14:val="none"/>
+        </w:rPr>
+      </w:pPr>
+      <w:hyperlink r:id="rId27" w:tgtFrame="_blank" w:history="1">
+        <w:r>
+          <w:rPr>
+            <w:rFonts w:ascii="Times New Roman" w:eastAsia="Times New Roman" w:hAnsi="Times New Roman" w:cs="Times New Roman"/>
+            <w:color w:val="0000FF"/>
+            <w:kern w:val="0"/>
+            <w:u w:val="single"/>
+            <w14:ligatures w14:val="none"/>
+          </w:rPr>
+          <w:t xml:space="preserve">Selivanova A et al. Outcomes after comprehensive vision rehabilitation using vision-related quality of life questionnaires: Impact of Vision Impairment and National Eye Institute Visual Functioning Questionnaire. Optom Vis Sci 2019</w:t>
+        </w:r>
+      </w:hyperlink>
+    </w:p>
+    <w:p>
+      <w:pPr>
+        <w:pStyle w:val="ListParagraph"/>
+        <w:spacing w:before="100" w:beforeAutospacing="1" w:after="100" w:afterAutospacing="1" w:line="240" w:lineRule="auto"/>
+        <w:rPr>
+          <w:rFonts w:ascii="Times New Roman" w:eastAsia="Times New Roman" w:hAnsi="Times New Roman" w:cs="Times New Roman"/>
+          <w:kern w:val="0"/>
+          <w14:ligatures w14:val="none"/>
+        </w:rPr>
+      </w:pPr>
+    </w:p>
+    <w:p>
+      <w:pPr>
+        <w:pStyle w:val="ListParagraph"/>
+        <w:numPr>
+          <w:ilvl w:val="0"/>
+          <w:numId w:val="3"/>
+        </w:numPr>
+        <w:spacing w:before="100" w:beforeAutospacing="1" w:after="100" w:afterAutospacing="1" w:line="240" w:lineRule="auto"/>
+        <w:rPr>
+          <w:rFonts w:ascii="Times New Roman" w:eastAsia="Times New Roman" w:hAnsi="Times New Roman" w:cs="Times New Roman"/>
+          <w:kern w:val="0"/>
+          <w14:ligatures w14:val="none"/>
+        </w:rPr>
+      </w:pPr>
+      <w:hyperlink r:id="rId28" w:tgtFrame="_blank" w:history="1">
+        <w:r>
+          <w:rPr>
+            <w:rFonts w:ascii="Times New Roman" w:eastAsia="Times New Roman" w:hAnsi="Times New Roman" w:cs="Times New Roman"/>
+            <w:color w:val="0000FF"/>
+            <w:kern w:val="0"/>
+            <w:u w:val="single"/>
+            <w14:ligatures w14:val="none"/>
+          </w:rPr>
+          <w:t xml:space="preserve">Szlyk JP et al. Performance of the Veterans Affairs Low Vision Visual Functioning Questionnaire. J Vis Impair Blind 2004</w:t>
+        </w:r>
+      </w:hyperlink>
+    </w:p>
+    <w:p>
+      <w:pPr>
+        <w:pStyle w:val="ListParagraph"/>
+        <w:spacing w:before="100" w:beforeAutospacing="1" w:after="100" w:afterAutospacing="1" w:line="240" w:lineRule="auto"/>
+        <w:rPr>
+          <w:rFonts w:ascii="Times New Roman" w:eastAsia="Times New Roman" w:hAnsi="Times New Roman" w:cs="Times New Roman"/>
+          <w:kern w:val="0"/>
+          <w14:ligatures w14:val="none"/>
+        </w:rPr>
+      </w:pPr>
+    </w:p>
+    <w:p>
+      <w:pPr>
+        <w:pStyle w:val="ListParagraph"/>
+        <w:numPr>
+          <w:ilvl w:val="0"/>
+          <w:numId w:val="3"/>
+        </w:numPr>
+        <w:spacing w:before="100" w:beforeAutospacing="1" w:after="100" w:afterAutospacing="1" w:line="240" w:lineRule="auto"/>
+        <w:rPr>
+          <w:rFonts w:ascii="Times New Roman" w:eastAsia="Times New Roman" w:hAnsi="Times New Roman" w:cs="Times New Roman"/>
+          <w:kern w:val="0"/>
+          <w14:ligatures w14:val="none"/>
+        </w:rPr>
+      </w:pPr>
+      <w:hyperlink r:id="rId29" w:tgtFrame="_blank" w:history="1">
+        <w:r>
+          <w:rPr>
+            <w:rFonts w:ascii="Times New Roman" w:eastAsia="Times New Roman" w:hAnsi="Times New Roman" w:cs="Times New Roman"/>
+            <w:color w:val="0000FF"/>
+            <w:kern w:val="0"/>
+            <w:u w:val="single"/>
+            <w14:ligatures w14:val="none"/>
+          </w:rPr>
+          <w:t xml:space="preserve">La Grow SJ. Predicting perceived quality of life scores from the National Eye Institute 25-item Visual Function Questionnaire. Optom Vis Sci 2007</w:t>
+        </w:r>
+      </w:hyperlink>
+    </w:p>
+    <w:p>
+      <w:pPr>
+        <w:pStyle w:val="ListParagraph"/>
+        <w:spacing w:before="100" w:beforeAutospacing="1" w:after="100" w:afterAutospacing="1" w:line="240" w:lineRule="auto"/>
+        <w:rPr>
+          <w:rFonts w:ascii="Times New Roman" w:eastAsia="Times New Roman" w:hAnsi="Times New Roman" w:cs="Times New Roman"/>
+          <w:kern w:val="0"/>
+          <w14:ligatures w14:val="none"/>
+        </w:rPr>
+      </w:pPr>
+    </w:p>
+    <w:p>
+      <w:pPr>
+        <w:pStyle w:val="ListParagraph"/>
+        <w:numPr>
+          <w:ilvl w:val="0"/>
+          <w:numId w:val="3"/>
+        </w:numPr>
+        <w:spacing w:before="100" w:beforeAutospacing="1" w:after="100" w:afterAutospacing="1" w:line="240" w:lineRule="auto"/>
+        <w:rPr>
+          <w:rFonts w:ascii="Times New Roman" w:eastAsia="Times New Roman" w:hAnsi="Times New Roman" w:cs="Times New Roman"/>
+          <w:kern w:val="0"/>
+          <w14:ligatures w14:val="none"/>
+        </w:rPr>
+      </w:pPr>
+      <w:hyperlink r:id="rId30" w:tgtFrame="_blank" w:history="1">
+        <w:r>
+          <w:rPr>
+            <w:rFonts w:ascii="Times New Roman" w:eastAsia="Times New Roman" w:hAnsi="Times New Roman" w:cs="Times New Roman"/>
+            <w:color w:val="0000FF"/>
+            <w:kern w:val="0"/>
+            <w:u w:val="single"/>
+            <w14:ligatures w14:val="none"/>
+          </w:rPr>
+          <w:t xml:space="preserve">Gresset J et al. Prevalence of visual impairment and utilization of rehabilitation services in the visually impaired elderly population of Quebec. Optom Vis Sci 2002</w:t>
+        </w:r>
+      </w:hyperlink>
+    </w:p>
+    <w:p>
+      <w:pPr>
+        <w:pStyle w:val="ListParagraph"/>
+        <w:spacing w:before="100" w:beforeAutospacing="1" w:after="100" w:afterAutospacing="1" w:line="240" w:lineRule="auto"/>
+        <w:rPr>
+          <w:rFonts w:ascii="Times New Roman" w:eastAsia="Times New Roman" w:hAnsi="Times New Roman" w:cs="Times New Roman"/>
+          <w:kern w:val="0"/>
+          <w14:ligatures w14:val="none"/>
+        </w:rPr>
+      </w:pPr>
+    </w:p>
+    <w:p>
+      <w:pPr>
+        <w:pStyle w:val="ListParagraph"/>
+        <w:numPr>
+          <w:ilvl w:val="0"/>
+          <w:numId w:val="3"/>
+        </w:numPr>
+        <w:spacing w:before="100" w:beforeAutospacing="1" w:after="100" w:afterAutospacing="1" w:line="240" w:lineRule="auto"/>
+        <w:rPr>
+          <w:rFonts w:ascii="Times New Roman" w:eastAsia="Times New Roman" w:hAnsi="Times New Roman" w:cs="Times New Roman"/>
+          <w:kern w:val="0"/>
+          <w14:ligatures w14:val="none"/>
+        </w:rPr>
+      </w:pPr>
+      <w:hyperlink r:id="rId31" w:tgtFrame="_blank" w:history="1">
+        <w:r>
+          <w:rPr>
+            <w:rFonts w:ascii="Times New Roman" w:eastAsia="Times New Roman" w:hAnsi="Times New Roman" w:cs="Times New Roman"/>
+            <w:color w:val="0000FF"/>
+            <w:kern w:val="0"/>
+            <w:u w:val="single"/>
+            <w14:ligatures w14:val="none"/>
+          </w:rPr>
+          <w:t xml:space="preserve">Murro V et al. Reading ability and quality of life in Stargardt disease. Eur J Ophthalmol 2017</w:t>
+        </w:r>
+      </w:hyperlink>
+    </w:p>
+    <w:p>
+      <w:pPr>
+        <w:pStyle w:val="ListParagraph"/>
+        <w:spacing w:before="100" w:beforeAutospacing="1" w:after="100" w:afterAutospacing="1" w:line="240" w:lineRule="auto"/>
+        <w:rPr>
+          <w:rFonts w:ascii="Times New Roman" w:eastAsia="Times New Roman" w:hAnsi="Times New Roman" w:cs="Times New Roman"/>
+          <w:kern w:val="0"/>
+          <w14:ligatures w14:val="none"/>
+        </w:rPr>
+      </w:pPr>
+    </w:p>
+    <w:p>
+      <w:pPr>
+        <w:pStyle w:val="ListParagraph"/>
+        <w:numPr>
+          <w:ilvl w:val="0"/>
+          <w:numId w:val="3"/>
+        </w:numPr>
+        <w:spacing w:before="100" w:beforeAutospacing="1" w:after="100" w:afterAutospacing="1" w:line="240" w:lineRule="auto"/>
+        <w:rPr>
+          <w:rFonts w:ascii="Times New Roman" w:eastAsia="Times New Roman" w:hAnsi="Times New Roman" w:cs="Times New Roman"/>
+          <w:kern w:val="0"/>
+          <w14:ligatures w14:val="none"/>
+        </w:rPr>
+      </w:pPr>
+      <w:hyperlink r:id="rId32" w:tgtFrame="_blank" w:history="1">
+        <w:r>
+          <w:rPr>
+            <w:rFonts w:ascii="Times New Roman" w:eastAsia="Times New Roman" w:hAnsi="Times New Roman" w:cs="Times New Roman"/>
+            <w:color w:val="0000FF"/>
+            <w:kern w:val="0"/>
+            <w:u w:val="single"/>
+            <w14:ligatures w14:val="none"/>
+          </w:rPr>
+          <w:t xml:space="preserve">Macnaughton J et al. Rehabilitation needs and activity limitations of adults with a visual impairment entering a low vision rehabilitation service in England. Ophthalmic Physiol Opt 2019</w:t>
+        </w:r>
+      </w:hyperlink>
+    </w:p>
+    <w:p>
+      <w:pPr>
+        <w:pStyle w:val="ListParagraph"/>
+        <w:spacing w:before="100" w:beforeAutospacing="1" w:after="100" w:afterAutospacing="1" w:line="240" w:lineRule="auto"/>
+        <w:rPr>
+          <w:rFonts w:ascii="Times New Roman" w:eastAsia="Times New Roman" w:hAnsi="Times New Roman" w:cs="Times New Roman"/>
+          <w:kern w:val="0"/>
+          <w14:ligatures w14:val="none"/>
+        </w:rPr>
+      </w:pPr>
+    </w:p>
+    <w:p>
+      <w:pPr>
+        <w:pStyle w:val="ListParagraph"/>
+        <w:numPr>
+          <w:ilvl w:val="0"/>
+          <w:numId w:val="3"/>
+        </w:numPr>
+        <w:spacing w:before="100" w:beforeAutospacing="1" w:after="100" w:afterAutospacing="1" w:line="240" w:lineRule="auto"/>
+        <w:rPr>
+          <w:rFonts w:ascii="Times New Roman" w:eastAsia="Times New Roman" w:hAnsi="Times New Roman" w:cs="Times New Roman"/>
+          <w:kern w:val="0"/>
+          <w14:ligatures w14:val="none"/>
+        </w:rPr>
+      </w:pPr>
+      <w:hyperlink r:id="rId33" w:tgtFrame="_blank" w:history="1">
+        <w:r>
+          <w:rPr>
+            <w:rFonts w:ascii="Times New Roman" w:eastAsia="Times New Roman" w:hAnsi="Times New Roman" w:cs="Times New Roman"/>
+            <w:color w:val="0000FF"/>
+            <w:kern w:val="0"/>
+            <w:u w:val="single"/>
+            <w14:ligatures w14:val="none"/>
+          </w:rPr>
+          <w:t xml:space="preserve">Smith TM et al. Responsiveness of the Revised Low Vision Independence Measure (LVIM-R). Am J Occup Ther 2020</w:t>
+        </w:r>
+      </w:hyperlink>
+    </w:p>
+    <w:p>
+      <w:pPr>
+        <w:pStyle w:val="ListParagraph"/>
+        <w:spacing w:before="100" w:beforeAutospacing="1" w:after="100" w:afterAutospacing="1" w:line="240" w:lineRule="auto"/>
+        <w:rPr>
+          <w:rFonts w:ascii="Times New Roman" w:eastAsia="Times New Roman" w:hAnsi="Times New Roman" w:cs="Times New Roman"/>
+          <w:kern w:val="0"/>
+          <w14:ligatures w14:val="none"/>
+        </w:rPr>
+      </w:pPr>
+    </w:p>
+    <w:p>
+      <w:pPr>
+        <w:pStyle w:val="ListParagraph"/>
+        <w:numPr>
+          <w:ilvl w:val="0"/>
+          <w:numId w:val="3"/>
+        </w:numPr>
+        <w:spacing w:before="100" w:beforeAutospacing="1" w:after="100" w:afterAutospacing="1" w:line="240" w:lineRule="auto"/>
+        <w:rPr>
+          <w:rFonts w:ascii="Times New Roman" w:eastAsia="Times New Roman" w:hAnsi="Times New Roman" w:cs="Times New Roman"/>
+          <w:kern w:val="0"/>
+          <w14:ligatures w14:val="none"/>
+        </w:rPr>
+      </w:pPr>
+      <w:hyperlink r:id="rId34" w:tgtFrame="_blank" w:history="1">
+        <w:r>
+          <w:rPr>
+            <w:rFonts w:ascii="Times New Roman" w:eastAsia="Times New Roman" w:hAnsi="Times New Roman" w:cs="Times New Roman"/>
+            <w:color w:val="0000FF"/>
+            <w:kern w:val="0"/>
+            <w:u w:val="single"/>
+            <w14:ligatures w14:val="none"/>
+          </w:rPr>
+          <w:t xml:space="preserve">Chou R et al. Screening for visual impairment in older adults: systematic review to update the 1996 U.S. Preventive Services Task Force recommendation. NCBI Bookshelf (NBK35192) 2009</w:t>
+        </w:r>
+      </w:hyperlink>
+    </w:p>
+    <w:p>
+      <w:pPr>
+        <w:pStyle w:val="ListParagraph"/>
+        <w:spacing w:before="100" w:beforeAutospacing="1" w:after="100" w:afterAutospacing="1" w:line="240" w:lineRule="auto"/>
+        <w:rPr>
+          <w:rFonts w:ascii="Times New Roman" w:eastAsia="Times New Roman" w:hAnsi="Times New Roman" w:cs="Times New Roman"/>
+          <w:kern w:val="0"/>
+          <w14:ligatures w14:val="none"/>
+        </w:rPr>
+      </w:pPr>
+    </w:p>
+    <w:p>
+      <w:pPr>
+        <w:pStyle w:val="ListParagraph"/>
+        <w:numPr>
+          <w:ilvl w:val="0"/>
+          <w:numId w:val="3"/>
+        </w:numPr>
+        <w:spacing w:before="100" w:beforeAutospacing="1" w:after="100" w:afterAutospacing="1" w:line="240" w:lineRule="auto"/>
+        <w:rPr>
+          <w:rFonts w:ascii="Times New Roman" w:eastAsia="Times New Roman" w:hAnsi="Times New Roman" w:cs="Times New Roman"/>
+          <w:kern w:val="0"/>
+          <w14:ligatures w14:val="none"/>
+        </w:rPr>
+      </w:pPr>
+      <w:hyperlink r:id="rId35" w:tgtFrame="_blank" w:history="1">
+        <w:r>
+          <w:rPr>
+            <w:rFonts w:ascii="Times New Roman" w:eastAsia="Times New Roman" w:hAnsi="Times New Roman" w:cs="Times New Roman"/>
+            <w:color w:val="0000FF"/>
+            <w:kern w:val="0"/>
+            <w:u w:val="single"/>
+            <w14:ligatures w14:val="none"/>
+          </w:rPr>
+          <w:t xml:space="preserve">Massof RW et al. Self-reported importance and difficulty of driving in a low-vision clinic population. IOVS 2007</w:t>
+        </w:r>
+      </w:hyperlink>
+    </w:p>
+    <w:p>
+      <w:pPr>
+        <w:pStyle w:val="ListParagraph"/>
+        <w:spacing w:before="100" w:beforeAutospacing="1" w:after="100" w:afterAutospacing="1" w:line="240" w:lineRule="auto"/>
+        <w:rPr>
+          <w:rFonts w:ascii="Times New Roman" w:eastAsia="Times New Roman" w:hAnsi="Times New Roman" w:cs="Times New Roman"/>
+          <w:kern w:val="0"/>
+          <w14:ligatures w14:val="none"/>
+        </w:rPr>
+      </w:pPr>
+    </w:p>
+    <w:p>
+      <w:pPr>
+        <w:pStyle w:val="ListParagraph"/>
+        <w:numPr>
+          <w:ilvl w:val="0"/>
+          <w:numId w:val="3"/>
+        </w:numPr>
+        <w:spacing w:before="100" w:beforeAutospacing="1" w:after="100" w:afterAutospacing="1" w:line="240" w:lineRule="auto"/>
+        <w:rPr>
+          <w:rFonts w:ascii="Times New Roman" w:eastAsia="Times New Roman" w:hAnsi="Times New Roman" w:cs="Times New Roman"/>
+          <w:kern w:val="0"/>
+          <w14:ligatures w14:val="none"/>
+        </w:rPr>
+      </w:pPr>
+      <w:hyperlink r:id="rId36" w:tgtFrame="_blank" w:history="1">
+        <w:r>
+          <w:rPr>
+            <w:rFonts w:ascii="Times New Roman" w:eastAsia="Times New Roman" w:hAnsi="Times New Roman" w:cs="Times New Roman"/>
+            <w:color w:val="0000FF"/>
+            <w:kern w:val="0"/>
+            <w:u w:val="single"/>
+            <w14:ligatures w14:val="none"/>
+          </w:rPr>
+          <w:t xml:space="preserve">Subramanian A et al. Spatial localization in visual impairment. IOVS 2006</w:t>
+        </w:r>
+      </w:hyperlink>
+    </w:p>
+    <w:p>
+      <w:pPr>
+        <w:pStyle w:val="ListParagraph"/>
+        <w:spacing w:before="100" w:beforeAutospacing="1" w:after="100" w:afterAutospacing="1" w:line="240" w:lineRule="auto"/>
+        <w:rPr>
+          <w:rFonts w:ascii="Times New Roman" w:eastAsia="Times New Roman" w:hAnsi="Times New Roman" w:cs="Times New Roman"/>
+          <w:kern w:val="0"/>
+          <w14:ligatures w14:val="none"/>
+        </w:rPr>
+      </w:pPr>
+    </w:p>
+    <w:p>
+      <w:pPr>
+        <w:pStyle w:val="ListParagraph"/>
+        <w:numPr>
+          <w:ilvl w:val="0"/>
+          <w:numId w:val="3"/>
+        </w:numPr>
+        <w:spacing w:before="100" w:beforeAutospacing="1" w:after="100" w:afterAutospacing="1" w:line="240" w:lineRule="auto"/>
+        <w:rPr>
+          <w:rFonts w:ascii="Times New Roman" w:eastAsia="Times New Roman" w:hAnsi="Times New Roman" w:cs="Times New Roman"/>
+          <w:kern w:val="0"/>
+          <w14:ligatures w14:val="none"/>
+        </w:rPr>
+      </w:pPr>
+      <w:hyperlink r:id="rId37" w:tgtFrame="_blank" w:history="1">
+        <w:r>
+          <w:rPr>
+            <w:rFonts w:ascii="Times New Roman" w:eastAsia="Times New Roman" w:hAnsi="Times New Roman" w:cs="Times New Roman"/>
+            <w:color w:val="0000FF"/>
+            <w:kern w:val="0"/>
+            <w:u w:val="single"/>
+            <w14:ligatures w14:val="none"/>
+          </w:rPr>
+          <w:t xml:space="preserve">Di Maggio I et al. The Veterans Affairs Low-Vision Visual Functioning Questionnaire-48 (VA LV VFQ-48): performance of the Italian version. Eur J Ophthalmol 2020</w:t>
+        </w:r>
+      </w:hyperlink>
+    </w:p>
+    <w:p>
+      <w:pPr>
+        <w:pStyle w:val="ListParagraph"/>
+        <w:spacing w:before="100" w:beforeAutospacing="1" w:after="100" w:afterAutospacing="1" w:line="240" w:lineRule="auto"/>
+        <w:rPr>
+          <w:rFonts w:ascii="Times New Roman" w:eastAsia="Times New Roman" w:hAnsi="Times New Roman" w:cs="Times New Roman"/>
+          <w:kern w:val="0"/>
+          <w14:ligatures w14:val="none"/>
+        </w:rPr>
+      </w:pPr>
+    </w:p>
+    <w:p>
+      <w:pPr>
+        <w:pStyle w:val="ListParagraph"/>
+        <w:numPr>
+          <w:ilvl w:val="0"/>
+          <w:numId w:val="3"/>
+        </w:numPr>
+        <w:spacing w:before="100" w:beforeAutospacing="1" w:after="100" w:afterAutospacing="1" w:line="240" w:lineRule="auto"/>
+        <w:rPr>
+          <w:rFonts w:ascii="Times New Roman" w:eastAsia="Times New Roman" w:hAnsi="Times New Roman" w:cs="Times New Roman"/>
+          <w:kern w:val="0"/>
+          <w14:ligatures w14:val="none"/>
+        </w:rPr>
+      </w:pPr>
+      <w:hyperlink r:id="rId38" w:tgtFrame="_blank" w:history="1">
+        <w:r>
+          <w:rPr>
+            <w:rFonts w:ascii="Times New Roman" w:eastAsia="Times New Roman" w:hAnsi="Times New Roman" w:cs="Times New Roman"/>
+            <w:color w:val="0000FF"/>
+            <w:kern w:val="0"/>
+            <w:u w:val="single"/>
+            <w14:ligatures w14:val="none"/>
+          </w:rPr>
+          <w:t xml:space="preserve">Sumi I et al. The relationship between visual disability and visual field in patients with glaucoma. Ophthalmology 2003</w:t>
+        </w:r>
+      </w:hyperlink>
+    </w:p>
+    <w:p>
+      <w:pPr>
+        <w:pStyle w:val="ListParagraph"/>
+        <w:spacing w:before="100" w:beforeAutospacing="1" w:after="100" w:afterAutospacing="1" w:line="240" w:lineRule="auto"/>
+        <w:rPr>
+          <w:rFonts w:ascii="Times New Roman" w:eastAsia="Times New Roman" w:hAnsi="Times New Roman" w:cs="Times New Roman"/>
+          <w:kern w:val="0"/>
+          <w14:ligatures w14:val="none"/>
+        </w:rPr>
+      </w:pPr>
+    </w:p>
+    <w:p>
+      <w:pPr>
+        <w:pStyle w:val="ListParagraph"/>
+        <w:numPr>
+          <w:ilvl w:val="0"/>
+          <w:numId w:val="3"/>
+        </w:numPr>
+        <w:spacing w:before="100" w:beforeAutospacing="1" w:after="100" w:afterAutospacing="1" w:line="240" w:lineRule="auto"/>
+        <w:rPr>
+          <w:rFonts w:ascii="Times New Roman" w:eastAsia="Times New Roman" w:hAnsi="Times New Roman" w:cs="Times New Roman"/>
+          <w:kern w:val="0"/>
+          <w14:ligatures w14:val="none"/>
+        </w:rPr>
+      </w:pPr>
+      <w:hyperlink r:id="rId39" w:tgtFrame="_blank" w:history="1">
+        <w:r>
+          <w:rPr>
+            <w:rFonts w:ascii="Times New Roman" w:eastAsia="Times New Roman" w:hAnsi="Times New Roman" w:cs="Times New Roman"/>
+            <w:color w:val="0000FF"/>
+            <w:kern w:val="0"/>
+            <w:u w:val="single"/>
+            <w14:ligatures w14:val="none"/>
+          </w:rPr>
+          <w:t xml:space="preserve">Dickson G et al. Time required for screening for visual impairment in primary care: a randomized comparison of 3 common visual tests. J Prim Care Community Health 2012</w:t>
+        </w:r>
+      </w:hyperlink>
+    </w:p>
+    <w:p>
+      <w:pPr>
+        <w:pStyle w:val="ListParagraph"/>
+        <w:spacing w:before="100" w:beforeAutospacing="1" w:after="100" w:afterAutospacing="1" w:line="240" w:lineRule="auto"/>
+        <w:rPr>
+          <w:rFonts w:ascii="Times New Roman" w:eastAsia="Times New Roman" w:hAnsi="Times New Roman" w:cs="Times New Roman"/>
+          <w:kern w:val="0"/>
+          <w14:ligatures w14:val="none"/>
+        </w:rPr>
+      </w:pPr>
+    </w:p>
+    <w:p>
+      <w:pPr>
+        <w:pStyle w:val="ListParagraph"/>
+        <w:numPr>
+          <w:ilvl w:val="0"/>
+          <w:numId w:val="3"/>
+        </w:numPr>
+        <w:spacing w:before="100" w:beforeAutospacing="1" w:after="100" w:afterAutospacing="1" w:line="240" w:lineRule="auto"/>
+        <w:rPr>
+          <w:rFonts w:ascii="Times New Roman" w:eastAsia="Times New Roman" w:hAnsi="Times New Roman" w:cs="Times New Roman"/>
+          <w:kern w:val="0"/>
+          <w14:ligatures w14:val="none"/>
+        </w:rPr>
+      </w:pPr>
+      <w:hyperlink r:id="rId40" w:tgtFrame="_blank" w:history="1">
+        <w:r>
+          <w:rPr>
+            <w:rFonts w:ascii="Times New Roman" w:eastAsia="Times New Roman" w:hAnsi="Times New Roman" w:cs="Times New Roman"/>
+            <w:color w:val="0000FF"/>
+            <w:kern w:val="0"/>
+            <w:u w:val="single"/>
+            <w14:ligatures w14:val="none"/>
+          </w:rPr>
+          <w:t xml:space="preserve">Surawatsatien N et al. Translation and testing psychometric properties of the Thai version of Vision Bolt-On EQ-5D in patients with visual impairment. Value Health Reg Issues 2026</w:t>
+        </w:r>
+      </w:hyperlink>
+    </w:p>
+    <w:p>
+      <w:pPr>
+        <w:pStyle w:val="ListParagraph"/>
+        <w:spacing w:before="100" w:beforeAutospacing="1" w:after="100" w:afterAutospacing="1" w:line="240" w:lineRule="auto"/>
+        <w:rPr>
+          <w:rFonts w:ascii="Times New Roman" w:eastAsia="Times New Roman" w:hAnsi="Times New Roman" w:cs="Times New Roman"/>
+          <w:kern w:val="0"/>
+          <w14:ligatures w14:val="none"/>
+        </w:rPr>
+      </w:pPr>
+    </w:p>
+    <w:p>
+      <w:pPr>
+        <w:pStyle w:val="ListParagraph"/>
+        <w:numPr>
+          <w:ilvl w:val="0"/>
+          <w:numId w:val="3"/>
+        </w:numPr>
+        <w:spacing w:before="100" w:beforeAutospacing="1" w:after="100" w:afterAutospacing="1" w:line="240" w:lineRule="auto"/>
+        <w:rPr>
+          <w:rFonts w:ascii="Times New Roman" w:eastAsia="Times New Roman" w:hAnsi="Times New Roman" w:cs="Times New Roman"/>
+          <w:kern w:val="0"/>
+          <w14:ligatures w14:val="none"/>
+        </w:rPr>
+      </w:pPr>
+      <w:hyperlink r:id="rId41" w:tgtFrame="_blank" w:history="1">
+        <w:r>
+          <w:rPr>
+            <w:rFonts w:ascii="Times New Roman" w:eastAsia="Times New Roman" w:hAnsi="Times New Roman" w:cs="Times New Roman"/>
+            <w:color w:val="0000FF"/>
+            <w:kern w:val="0"/>
+            <w:u w:val="single"/>
+            <w14:ligatures w14:val="none"/>
+          </w:rPr>
+          <w:t xml:space="preserve">Pérez-Mañá L et al. Validation of the Spanish version of the Low Vision Quality of Life Questionnaire. J Optom 2022</w:t>
+        </w:r>
+      </w:hyperlink>
+    </w:p>
+    <w:p>
+      <w:pPr>
+        <w:pStyle w:val="ListParagraph"/>
+        <w:spacing w:before="100" w:beforeAutospacing="1" w:after="100" w:afterAutospacing="1" w:line="240" w:lineRule="auto"/>
+        <w:rPr>
+          <w:rFonts w:ascii="Times New Roman" w:eastAsia="Times New Roman" w:hAnsi="Times New Roman" w:cs="Times New Roman"/>
+          <w:kern w:val="0"/>
+          <w14:ligatures w14:val="none"/>
+        </w:rPr>
+      </w:pPr>
+    </w:p>
+    <w:p>
+      <w:pPr>
+        <w:pStyle w:val="ListParagraph"/>
+        <w:numPr>
+          <w:ilvl w:val="0"/>
+          <w:numId w:val="3"/>
+        </w:numPr>
+        <w:spacing w:before="100" w:beforeAutospacing="1" w:after="100" w:afterAutospacing="1" w:line="240" w:lineRule="auto"/>
+        <w:rPr>
+          <w:rFonts w:ascii="Times New Roman" w:eastAsia="Times New Roman" w:hAnsi="Times New Roman" w:cs="Times New Roman"/>
+          <w:kern w:val="0"/>
+          <w14:ligatures w14:val="none"/>
+        </w:rPr>
+      </w:pPr>
+      <w:hyperlink r:id="rId42" w:tgtFrame="_blank" w:history="1">
+        <w:r>
+          <w:rPr>
+            <w:rFonts w:ascii="Times New Roman" w:eastAsia="Times New Roman" w:hAnsi="Times New Roman" w:cs="Times New Roman"/>
+            <w:color w:val="0000FF"/>
+            <w:kern w:val="0"/>
+            <w:u w:val="single"/>
+            <w14:ligatures w14:val="none"/>
+          </w:rPr>
+          <w:t xml:space="preserve">Bibby SA et al. Vision and self-reported mobility performance in patients with low vision. Clin Exp Optom 2007</w:t>
         </w:r>
       </w:hyperlink>
     </w:p>

</xml_diff>